<commit_message>
Komplet rev6: bez terminu wydania dokumentu przez UDT, wniosek do UDT do 31.12.2026
Co-Authored-By: Claude Sonnet 5.5 <noreply@anthropic.com>
Claude-Session: https://claude.ai/code/session_014oD5P5yiRwT6Zb7b7udEcr
</commit_message>
<xml_diff>
--- a/komplet_zapytanie_nr1_rev6/5_Zalacznik_5_Wzor_umowy_zmiany_sledzone.docx
+++ b/komplet_zapytanie_nr1_rev6/5_Zalacznik_5_Wzor_umowy_zmiany_sledzone.docx
@@ -1149,7 +1149,7 @@
       <w:r>
         <w:t xml:space="preserve"> jako podmiot eksploatujący, do UDT o badania techniczne stacji </w:t>
       </w:r>
-      <w:ins w:id="5170" w:author="Ewa Retajczyk" w:date="2026-10-20T15:01:34Z">
+      <w:ins w:id="5186" w:author="Ewa Retajczyk" w:date="2026-10-20T15:01:34Z">
         <w:r>
           <w:t xml:space="preserve">(wniosek zostanie złożony nie później niż do dnia 31.12.2026 r.) </w:t>
         </w:r>
@@ -1317,30 +1317,27 @@
       <w:r>
         <w:t xml:space="preserve"> Inwestycji wynika z Umowy o dofinansowanie (31.12.2026 r.)</w:t>
       </w:r>
-      <w:ins w:id="5152" w:author="Ewa Retajczyk" w:date="2026-10-20T15:01:49Z">
-        <w:r>
-          <w:t xml:space="preserve">. Zamawiający złoży do UDT wniosek o badanie techniczne wszystkich Stacji ładowania nie później niż do dnia 31.12.2026 r.</w:t>
+      <w:del w:id="5152" w:author="Ewa Retajczyk" w:date="2026-10-20T15:01:49Z">
+        <w:r>
+          <w:delText xml:space="preserve">,</w:delText>
+        </w:r>
+      </w:del>
+      <w:ins w:id="5153" w:author="Ewa Retajczyk" w:date="2026-10-20T15:01:52Z">
+        <w:r>
+          <w:t xml:space="preserve">.</w:t>
         </w:r>
       </w:ins>
       <w:r>
-        <w:t xml:space="preserve">, a </w:t>
-      </w:r>
-      <w:del w:id="5153" w:author="Ewa Retajczyk" w:date="2026-10-20T15:01:52Z">
-        <w:r>
-          <w:delText xml:space="preserve">datą zakończenia realizacji Inwestycji jest – zgodnie z Umową o dofinansowanie – data ostatniego protokołu </w:delText>
-        </w:r>
-      </w:del>
-      <w:r>
-        <w:t xml:space="preserve">UDT </w:t>
+        <w:t xml:space="preserve"> </w:t>
       </w:r>
       <w:del w:id="5154" w:author="Ewa Retajczyk" w:date="2026-10-20T15:01:53Z">
         <w:r>
-          <w:delText xml:space="preserve">dopuszczającego</w:delText>
+          <w:delText xml:space="preserve">a</w:delText>
         </w:r>
       </w:del>
       <w:ins w:id="5155" w:author="Ewa Retajczyk" w:date="2026-10-20T15:02:01Z">
         <w:r>
-          <w:t xml:space="preserve">wydaje</w:t>
+          <w:t xml:space="preserve">Zamawiający</w:t>
         </w:r>
       </w:ins>
       <w:r>
@@ -1348,104 +1345,208 @@
       </w:r>
       <w:del w:id="5156" w:author="Ewa Retajczyk" w:date="2026-10-20T15:02:05Z">
         <w:r>
-          <w:delText xml:space="preserve">Stację</w:delText>
+          <w:delText xml:space="preserve">datą</w:delText>
         </w:r>
       </w:del>
       <w:ins w:id="5157" w:author="Ewa Retajczyk" w:date="2026-10-20T15:02:10Z">
         <w:r>
-          <w:t xml:space="preserve">dokument dopuszczający Stacje</w:t>
+          <w:t xml:space="preserve">złoży</w:t>
         </w:r>
       </w:ins>
       <w:r>
-        <w:t xml:space="preserve"> ładowania do eksploatacji</w:t>
-      </w:r>
-      <w:ins w:id="5158" w:author="Ewa Retajczyk" w:date="2026-10-20T15:02:25Z">
-        <w:r>
-          <w:t xml:space="preserve"> w terminie do 60 dni od złożenia wniosku</w:t>
+        <w:t xml:space="preserve"> </w:t>
+      </w:r>
+      <w:del w:id="5158" w:author="Ewa Retajczyk" w:date="2026-10-20T15:02:25Z">
+        <w:r>
+          <w:delText xml:space="preserve">zakończenia</w:delText>
+        </w:r>
+      </w:del>
+      <w:ins w:id="5159" w:author="Ewa Retajczyk" w:date="2026-10-20T15:02:34Z">
+        <w:r>
+          <w:t xml:space="preserve">do</w:t>
         </w:r>
       </w:ins>
       <w:r>
-        <w:t xml:space="preserve">. Wykonawca</w:t>
-      </w:r>
-      <w:ins w:id="5159" w:author="Ewa Retajczyk" w:date="2026-10-20T15:02:43Z">
-        <w:r>
-          <w:t xml:space="preserve"> przekaże dokumentację niezbędną do złożenia wniosku w terminie umożliwiającym jego złożenie do dnia 31.12.2026 r. oraz</w:t>
+        <w:t xml:space="preserve"> </w:t>
+      </w:r>
+      <w:del w:id="5160" w:author="Ewa Retajczyk" w:date="2026-10-20T15:02:43Z">
+        <w:r>
+          <w:delText xml:space="preserve">realizacji</w:delText>
+        </w:r>
+      </w:del>
+      <w:ins w:id="5161" w:author="Ewa Retajczyk" w:date="2026-10-20T15:03:02Z">
+        <w:r>
+          <w:t xml:space="preserve">UDT</w:t>
         </w:r>
       </w:ins>
       <w:r>
-        <w:t xml:space="preserve"> zapewnia swój udział w </w:t>
-      </w:r>
-      <w:r>
-        <w:t xml:space="preserve">badaniach UDT i usuwanie usterek </w:t>
-      </w:r>
-      <w:ins w:id="5160" w:author="Ewa Retajczyk" w:date="2026-10-20T15:03:02Z">
-        <w:r>
-          <w:t xml:space="preserve">również </w:t>
+        <w:t xml:space="preserve"> </w:t>
+      </w:r>
+      <w:del w:id="5162" w:author="Ewa Retajczyk" w:date="2026-10-20T15:03:03Z">
+        <w:r>
+          <w:delText xml:space="preserve">Inwestycji jest – zgodnie z Umową</w:delText>
+        </w:r>
+      </w:del>
+      <w:ins w:id="5163" w:author="Ewa Retajczyk" w:date="2026-10-20T15:03:06Z">
+        <w:r>
+          <w:t xml:space="preserve">wniosek</w:t>
         </w:r>
       </w:ins>
       <w:r>
-        <w:t xml:space="preserve">w </w:t>
-      </w:r>
-      <w:del w:id="5161" w:author="Ewa Retajczyk" w:date="2026-10-20T15:03:06Z">
-        <w:r>
-          <w:delText xml:space="preserve">terminie umożliwiającym uzyskanie dopuszczenia wszystkich Stacji ładowania</w:delText>
+        <w:t xml:space="preserve"> o </w:t>
+      </w:r>
+      <w:del w:id="5164" w:author="Ewa Retajczyk" w:date="2026-10-20T15:03:30Z">
+        <w:r>
+          <w:delText xml:space="preserve">dofinansowanie</w:delText>
         </w:r>
       </w:del>
-      <w:ins w:id="5162" w:author="Ewa Retajczyk" w:date="2026-10-20T15:03:30Z">
-        <w:r>
-          <w:t xml:space="preserve">okresie</w:t>
+      <w:ins w:id="5165" w:author="Ewa Retajczyk" w:date="2026-10-20T15:03:32Z">
+        <w:r>
+          <w:t xml:space="preserve">badanie</w:t>
         </w:r>
       </w:ins>
       <w:r>
+        <w:t xml:space="preserve"> </w:t>
+      </w:r>
+      <w:del w:id="5166" w:author="Ewa Retajczyk" w:date="2026-10-20T15:03:32Z">
+        <w:r>
+          <w:delText xml:space="preserve">– data ostatniego protokołu UDT dopuszczającego Stację ładowania do eksploatacji. Wykonawca zapewnia swój udział w </w:delText>
+        </w:r>
+        <w:r>
+          <w:delText xml:space="preserve">badaniach UDT i usuwanie usterek w terminie umożliwiającym uzyskanie dopuszczenia</w:delText>
+        </w:r>
+      </w:del>
+      <w:ins w:id="5167" w:author="Ewa Retajczyk" w:date="2026-10-20T15:03:41Z">
+        <w:r>
+          <w:t xml:space="preserve">techniczne</w:t>
+        </w:r>
+      </w:ins>
+      <w:r>
+        <w:t xml:space="preserve"> wszystkich Stacji ładowania</w:t>
+      </w:r>
+      <w:del w:id="5168" w:author="Ewa Retajczyk" w:date="2026-10-20T15:03:42Z">
+        <w:r>
+          <w:delText xml:space="preserve"> do eksploatacji</w:delText>
+        </w:r>
+      </w:del>
+      <w:r>
+        <w:t xml:space="preserve"> </w:t>
+      </w:r>
+      <w:r>
+        <w:t xml:space="preserve">nie później</w:t>
+      </w:r>
+      <w:r>
+        <w:t xml:space="preserve"> niż do dnia 31.12.2026 r. </w:t>
+      </w:r>
+      <w:del w:id="5169" w:author="Ewa Retajczyk" w:date="2026-10-20T15:03:52Z">
+        <w:r>
+          <w:delText xml:space="preserve">(albo</w:delText>
+        </w:r>
+      </w:del>
+      <w:ins w:id="5170" w:author="Ewa Retajczyk" w:date="2026-10-20T15:04:19Z">
+        <w:r>
+          <w:t xml:space="preserve">Wykonawca przekaże dokumentację niezbędną</w:t>
+        </w:r>
+      </w:ins>
+      <w:r>
         <w:t xml:space="preserve"> do </w:t>
       </w:r>
-      <w:del w:id="5163" w:author="Ewa Retajczyk" w:date="2026-10-20T15:03:32Z">
-        <w:r>
-          <w:delText xml:space="preserve">eksploatacji</w:delText>
+      <w:del w:id="5171" w:author="Ewa Retajczyk" w:date="2026-10-20T15:04:27Z">
+        <w:r>
+          <w:delText xml:space="preserve">terminu</w:delText>
         </w:r>
       </w:del>
-      <w:ins w:id="5164" w:author="Ewa Retajczyk" w:date="2026-10-20T15:03:32Z">
-        <w:r>
-          <w:t xml:space="preserve">wydania</w:t>
+      <w:ins w:id="5172" w:author="Ewa Retajczyk" w:date="2026-10-20T15:04:31Z">
+        <w:r>
+          <w:t xml:space="preserve">złożenia</w:t>
         </w:r>
       </w:ins>
       <w:r>
         <w:t xml:space="preserve"> </w:t>
       </w:r>
-      <w:del w:id="5165" w:author="Ewa Retajczyk" w:date="2026-10-20T15:03:42Z">
-        <w:r>
-          <w:delText xml:space="preserve">nie</w:delText>
+      <w:del w:id="5173" w:author="Ewa Retajczyk" w:date="2026-10-20T15:04:31Z">
+        <w:r>
+          <w:delText xml:space="preserve">wynikającego</w:delText>
         </w:r>
       </w:del>
-      <w:ins w:id="5166" w:author="Ewa Retajczyk" w:date="2026-10-20T15:03:52Z">
-        <w:r>
-          <w:t xml:space="preserve">dokumentu</w:t>
+      <w:ins w:id="5174" w:author="Ewa Retajczyk" w:date="2026-10-20T15:04:32Z">
+        <w:r>
+          <w:t xml:space="preserve">wniosku</w:t>
         </w:r>
       </w:ins>
       <w:r>
         <w:t xml:space="preserve"> </w:t>
       </w:r>
-      <w:del w:id="5167" w:author="Ewa Retajczyk" w:date="2026-10-20T15:04:19Z">
-        <w:r>
-          <w:delText xml:space="preserve">później</w:delText>
-        </w:r>
-        <w:r>
-          <w:delText xml:space="preserve"> niż do dnia 31</w:delText>
+      <w:del w:id="5175" w:author="Ewa Retajczyk" w:date="2026-10-20T15:04:33Z">
+        <w:r>
+          <w:delText xml:space="preserve">z</w:delText>
         </w:r>
       </w:del>
-      <w:ins w:id="5168" w:author="Ewa Retajczyk" w:date="2026-10-20T15:04:31Z">
-        <w:r>
-          <w:t xml:space="preserve">dopuszczającego</w:t>
+      <w:ins w:id="5176" w:author="Ewa Retajczyk" w:date="2026-10-20T15:04:50Z">
+        <w:r>
+          <w:t xml:space="preserve">w</w:t>
         </w:r>
       </w:ins>
       <w:r>
-        <w:t xml:space="preserve">.</w:t>
-      </w:r>
-      <w:del w:id="5169" w:author="Ewa Retajczyk" w:date="2026-10-20T15:04:31Z">
-        <w:r>
-          <w:delText xml:space="preserve">12.2026 r. (albo do terminu wynikającego z aneksu do Umowy o dofinansowanie). </w:delText>
+        <w:t xml:space="preserve"> </w:t>
+      </w:r>
+      <w:del w:id="5177" w:author="Ewa Retajczyk" w:date="2026-10-20T15:04:52Z">
+        <w:r>
+          <w:delText xml:space="preserve">aneksu</w:delText>
         </w:r>
       </w:del>
+      <w:ins w:id="5178" w:author="Ewa Retajczyk" w:date="2026-10-20T15:05:02Z">
+        <w:r>
+          <w:t xml:space="preserve">terminie umożliwiającym jego złożenie</w:t>
+        </w:r>
+      </w:ins>
+      <w:r>
+        <w:t xml:space="preserve"> do </w:t>
+      </w:r>
+      <w:del w:id="5179" w:author="Ewa Retajczyk" w:date="2026-10-20T15:05:17Z">
+        <w:r>
+          <w:delText xml:space="preserve">Umowy</w:delText>
+        </w:r>
+      </w:del>
+      <w:ins w:id="5180" w:author="Ewa Retajczyk" w:date="2026-10-20T15:05:25Z">
+        <w:r>
+          <w:t xml:space="preserve">dnia</w:t>
+        </w:r>
+      </w:ins>
+      <w:r>
+        <w:t xml:space="preserve"> </w:t>
+      </w:r>
+      <w:del w:id="5181" w:author="Ewa Retajczyk" w:date="2026-10-20T15:06:10Z">
+        <w:r>
+          <w:delText xml:space="preserve">o</w:delText>
+        </w:r>
+      </w:del>
+      <w:ins w:id="5182" w:author="Ewa Retajczyk" w:date="2026-10-20T15:06:15Z">
+        <w:r>
+          <w:t xml:space="preserve">31.12.2026</w:t>
+        </w:r>
+      </w:ins>
+      <w:r>
+        <w:t xml:space="preserve"> </w:t>
+      </w:r>
+      <w:del w:id="5183" w:author="Ewa Retajczyk" w:date="2026-10-20T15:06:41Z">
+        <w:r>
+          <w:delText xml:space="preserve">dofinansowanie)</w:delText>
+        </w:r>
+      </w:del>
+      <w:ins w:id="5184" w:author="Ewa Retajczyk" w:date="2026-10-20T15:06:57Z">
+        <w:r>
+          <w:t xml:space="preserve">r</w:t>
+        </w:r>
+      </w:ins>
+      <w:r>
+        <w:t xml:space="preserve">. </w:t>
+      </w:r>
+      <w:ins w:id="5185" w:author="Ewa Retajczyk" w:date="2026-10-20T15:07:00Z">
+        <w:r>
+          <w:t xml:space="preserve">oraz zapewnia swój udział w badaniach UDT i usuwanie usterek stwierdzonych w ich trakcie, również po tej dacie.</w:t>
+        </w:r>
+      </w:ins>
     </w:p>
     <w:p>
       <w:pPr>
@@ -1456,12 +1557,12 @@
       <w:r>
         <w:t xml:space="preserve">4. Terminy, o których mowa w ust. 1 i 2, ulegają przedłużeniu o czas trwania przeszkód, za które Wykonawca nie odpowiada, w szczególności: opóźnienia w gotowości fundamentów, stanowisk lub zasilania (Zamówienia nr 2 i nr 3), działań operatora sieci dystrybucyjnej, organów administracji lub UDT, oraz siły wyższej – pod warunkiem, że Wykonawca powiadomił o przeszkodzie niezwłocznie, nie później niż w ciągu 3 dni od jej wystąpienia, i udokumentował jej wpływ na termin. </w:t>
       </w:r>
-      <w:del w:id="5044" w:author="Ewa Retajczyk" w:date="2026-10-20T15:04:32Z">
+      <w:del w:id="5044" w:author="Ewa Retajczyk" w:date="2026-10-20T15:07:19Z">
         <w:r>
           <w:delText xml:space="preserve">Zmiana</w:delText>
         </w:r>
       </w:del>
-      <w:ins w:id="5045" w:author="Ewa Retajczyk" w:date="2026-10-20T15:04:33Z">
+      <w:ins w:id="5045" w:author="Ewa Retajczyk" w:date="2026-10-20T15:07:25Z">
         <w:r>
           <w:t xml:space="preserve">Przedłużenie</w:t>
         </w:r>
@@ -1469,12 +1570,12 @@
       <w:r>
         <w:t xml:space="preserve"> terminu </w:t>
       </w:r>
-      <w:del w:id="5046" w:author="Ewa Retajczyk" w:date="2026-10-20T15:04:52Z">
+      <w:del w:id="5046" w:author="Ewa Retajczyk" w:date="2026-10-20T15:07:34Z">
         <w:r>
           <w:delText xml:space="preserve">następuje</w:delText>
         </w:r>
       </w:del>
-      <w:ins w:id="5047" w:author="Ewa Retajczyk" w:date="2026-10-20T15:05:02Z">
+      <w:ins w:id="5047" w:author="Ewa Retajczyk" w:date="2026-10-20T15:07:52Z">
         <w:r>
           <w:t xml:space="preserve">Strony</w:t>
         </w:r>
@@ -1482,12 +1583,12 @@
       <w:r>
         <w:t xml:space="preserve"> </w:t>
       </w:r>
-      <w:del w:id="5048" w:author="Ewa Retajczyk" w:date="2026-10-20T15:05:17Z">
+      <w:del w:id="5048" w:author="Ewa Retajczyk" w:date="2026-10-20T15:07:56Z">
         <w:r>
           <w:delText xml:space="preserve">wówczas</w:delText>
         </w:r>
       </w:del>
-      <w:ins w:id="5049" w:author="Ewa Retajczyk" w:date="2026-10-20T15:05:25Z">
+      <w:ins w:id="5049" w:author="Ewa Retajczyk" w:date="2026-10-20T15:08:21Z">
         <w:r>
           <w:t xml:space="preserve">potwierdzają</w:t>
         </w:r>
@@ -1495,12 +1596,12 @@
       <w:r>
         <w:t xml:space="preserve"> </w:t>
       </w:r>
-      <w:del w:id="5050" w:author="Ewa Retajczyk" w:date="2026-10-20T15:06:10Z">
+      <w:del w:id="5050" w:author="Ewa Retajczyk" w:date="2026-10-20T15:08:32Z">
         <w:r>
           <w:delText xml:space="preserve">w</w:delText>
         </w:r>
       </w:del>
-      <w:ins w:id="5051" w:author="Ewa Retajczyk" w:date="2026-10-20T15:06:15Z">
+      <w:ins w:id="5051" w:author="Ewa Retajczyk" w:date="2026-10-20T15:08:38Z">
         <w:r>
           <w:t xml:space="preserve">aneksem</w:t>
         </w:r>
@@ -1508,12 +1609,12 @@
       <w:r>
         <w:t xml:space="preserve"> </w:t>
       </w:r>
-      <w:del w:id="5052" w:author="Ewa Retajczyk" w:date="2026-10-20T15:06:41Z">
+      <w:del w:id="5052" w:author="Ewa Retajczyk" w:date="2026-10-20T15:08:41Z">
         <w:r>
           <w:delText xml:space="preserve">formie</w:delText>
         </w:r>
       </w:del>
-      <w:ins w:id="5053" w:author="Ewa Retajczyk" w:date="2026-10-20T15:06:57Z">
+      <w:ins w:id="5053" w:author="Ewa Retajczyk" w:date="2026-10-20T15:08:59Z">
         <w:r>
           <w:t xml:space="preserve">do</w:t>
         </w:r>
@@ -1521,12 +1622,12 @@
       <w:r>
         <w:t xml:space="preserve"> </w:t>
       </w:r>
-      <w:del w:id="5054" w:author="Ewa Retajczyk" w:date="2026-10-20T15:07:00Z">
+      <w:del w:id="5054" w:author="Ewa Retajczyk" w:date="2026-10-20T15:09:15Z">
         <w:r>
           <w:delText xml:space="preserve">pisemnej</w:delText>
         </w:r>
       </w:del>
-      <w:ins w:id="5055" w:author="Ewa Retajczyk" w:date="2026-10-20T15:07:19Z">
+      <w:ins w:id="5055" w:author="Ewa Retajczyk" w:date="2026-10-20T15:09:24Z">
         <w:r>
           <w:t xml:space="preserve">Umowy</w:t>
         </w:r>
@@ -1534,12 +1635,12 @@
       <w:r>
         <w:t xml:space="preserve"> (</w:t>
       </w:r>
-      <w:del w:id="5056" w:author="Ewa Retajczyk" w:date="2026-10-20T15:07:25Z">
+      <w:del w:id="5056" w:author="Ewa Retajczyk" w:date="2026-10-20T15:09:25Z">
         <w:r>
           <w:delText xml:space="preserve">potwierdzenie</w:delText>
         </w:r>
       </w:del>
-      <w:ins w:id="5057" w:author="Ewa Retajczyk" w:date="2026-10-20T15:07:52Z">
+      <w:ins w:id="5057" w:author="Ewa Retajczyk" w:date="2026-10-20T15:09:42Z">
         <w:r>
           <w:t xml:space="preserve">§</w:t>
         </w:r>
@@ -1547,12 +1648,12 @@
       <w:r>
         <w:t xml:space="preserve"> </w:t>
       </w:r>
-      <w:del w:id="5058" w:author="Ewa Retajczyk" w:date="2026-10-20T15:08:21Z">
+      <w:del w:id="5058" w:author="Ewa Retajczyk" w:date="2026-10-20T15:10:12Z">
         <w:r>
           <w:delText xml:space="preserve">e-mailowe</w:delText>
         </w:r>
       </w:del>
-      <w:ins w:id="5059" w:author="Ewa Retajczyk" w:date="2026-10-20T15:08:32Z">
+      <w:ins w:id="5059" w:author="Ewa Retajczyk" w:date="2026-10-20T15:10:16Z">
         <w:r>
           <w:t xml:space="preserve">15</w:t>
         </w:r>
@@ -1560,12 +1661,12 @@
       <w:r>
         <w:t xml:space="preserve"> </w:t>
       </w:r>
-      <w:del w:id="5060" w:author="Ewa Retajczyk" w:date="2026-10-20T15:08:38Z">
+      <w:del w:id="5060" w:author="Ewa Retajczyk" w:date="2026-10-20T15:10:25Z">
         <w:r>
           <w:delText xml:space="preserve">jest</w:delText>
         </w:r>
       </w:del>
-      <w:ins w:id="5061" w:author="Ewa Retajczyk" w:date="2026-10-20T15:08:41Z">
+      <w:ins w:id="5061" w:author="Ewa Retajczyk" w:date="2026-10-20T15:10:45Z">
         <w:r>
           <w:t xml:space="preserve">ust.</w:t>
         </w:r>
@@ -1573,12 +1674,12 @@
       <w:r>
         <w:t xml:space="preserve"> </w:t>
       </w:r>
-      <w:del w:id="5062" w:author="Ewa Retajczyk" w:date="2026-10-20T15:08:59Z">
+      <w:del w:id="5062" w:author="Ewa Retajczyk" w:date="2026-10-20T15:10:54Z">
         <w:r>
           <w:delText xml:space="preserve">wystarczające</w:delText>
         </w:r>
       </w:del>
-      <w:ins w:id="5063" w:author="Ewa Retajczyk" w:date="2026-10-20T15:09:15Z">
+      <w:ins w:id="5063" w:author="Ewa Retajczyk" w:date="2026-10-20T15:10:55Z">
         <w:r>
           <w:t xml:space="preserve">2 lit. b</w:t>
         </w:r>
@@ -1657,7 +1758,7 @@
         </w:rPr>
         <w:t xml:space="preserve">[</w:t>
       </w:r>
-      <w:del w:id="5064" w:author="Ewa Retajczyk" w:date="2026-10-20T15:09:24Z">
+      <w:del w:id="5064" w:author="Ewa Retajczyk" w:date="2026-10-20T15:10:58Z">
         <w:r>
           <w:rPr>
             <w:b/>
@@ -1673,7 +1774,7 @@
         </w:rPr>
         <w:t xml:space="preserve">……</w:t>
       </w:r>
-      <w:del w:id="5065" w:author="Ewa Retajczyk" w:date="2026-10-20T15:09:25Z">
+      <w:del w:id="5065" w:author="Ewa Retajczyk" w:date="2026-10-20T15:11:04Z">
         <w:r>
           <w:rPr>
             <w:b/>
@@ -1714,7 +1815,7 @@
         </w:rPr>
         <w:t xml:space="preserve">[</w:t>
       </w:r>
-      <w:del w:id="5066" w:author="Ewa Retajczyk" w:date="2026-10-20T15:09:42Z">
+      <w:del w:id="5066" w:author="Ewa Retajczyk" w:date="2026-10-20T15:11:10Z">
         <w:r>
           <w:rPr>
             <w:b/>
@@ -1730,7 +1831,7 @@
         </w:rPr>
         <w:t xml:space="preserve">……</w:t>
       </w:r>
-      <w:del w:id="5067" w:author="Ewa Retajczyk" w:date="2026-10-20T15:10:12Z">
+      <w:del w:id="5067" w:author="Ewa Retajczyk" w:date="2026-10-20T15:11:34Z">
         <w:r>
           <w:rPr>
             <w:b/>
@@ -1765,12 +1866,12 @@
       <w:r>
         <w:t xml:space="preserve">2. Wynagrodzenie obejmuje wszystkie koszty niezbędne do wykonania Przedmiotu Umowy, w szczególności: dostawę, transport, rozładunek, ubezpieczenia, montaż, konfigurację, licencje i oprogramowanie </w:t>
       </w:r>
-      <w:del w:id="5141" w:author="Ewa Retajczyk" w:date="2026-10-20T15:10:45Z">
+      <w:del w:id="5141" w:author="Ewa Retajczyk" w:date="2026-10-20T15:11:43Z">
         <w:r>
           <w:delText xml:space="preserve">na</w:delText>
         </w:r>
       </w:del>
-      <w:ins w:id="5142" w:author="Ewa Retajczyk" w:date="2026-10-20T15:10:54Z">
+      <w:ins w:id="5142" w:author="Ewa Retajczyk" w:date="2026-10-20T15:11:46Z">
         <w:r>
           <w:t xml:space="preserve">niezbędne</w:t>
         </w:r>
@@ -1778,12 +1879,12 @@
       <w:r>
         <w:t xml:space="preserve"> </w:t>
       </w:r>
-      <w:del w:id="5143" w:author="Ewa Retajczyk" w:date="2026-10-20T15:10:58Z">
+      <w:del w:id="5143" w:author="Ewa Retajczyk" w:date="2026-10-20T15:11:54Z">
         <w:r>
           <w:delText xml:space="preserve">pierwszy</w:delText>
         </w:r>
       </w:del>
-      <w:ins w:id="5144" w:author="Ewa Retajczyk" w:date="2026-10-20T15:11:04Z">
+      <w:ins w:id="5144" w:author="Ewa Retajczyk" w:date="2026-10-20T15:11:58Z">
         <w:r>
           <w:t xml:space="preserve">do uruchomienia i funkcjonowania systemu w zakresie kosztów ponoszonych do dnia 31.12.2026 r. (koszty abonamentów, licencji okresowych i usług za</w:t>
         </w:r>
@@ -1791,12 +1892,12 @@
       <w:r>
         <w:t xml:space="preserve"> okres </w:t>
       </w:r>
-      <w:del w:id="5145" w:author="Ewa Retajczyk" w:date="2026-10-20T15:11:10Z">
+      <w:del w:id="5145" w:author="Ewa Retajczyk" w:date="2026-10-20T15:12:27Z">
         <w:r>
           <w:delText xml:space="preserve">użytkowania</w:delText>
         </w:r>
       </w:del>
-      <w:ins w:id="5146" w:author="Ewa Retajczyk" w:date="2026-10-20T15:11:34Z">
+      <w:ins w:id="5146" w:author="Ewa Retajczyk" w:date="2026-10-20T15:12:32Z">
         <w:r>
           <w:t xml:space="preserve">po tej dacie nie wchodzą w wynagrodzenie)</w:t>
         </w:r>
@@ -1843,7 +1944,7 @@
       <w:r>
         <w:t xml:space="preserve"> w wysokości</w:t>
       </w:r>
-      <w:del w:id="5147" w:author="Ewa Retajczyk" w:date="2026-10-20T15:11:43Z">
+      <w:del w:id="5147" w:author="Ewa Retajczyk" w:date="2026-10-20T15:12:34Z">
         <w:r>
           <w:delText xml:space="preserve"> </w:delText>
         </w:r>
@@ -2176,7 +2277,7 @@
       <w:r>
         <w:t xml:space="preserve">5. Odbiór końcowy następuje po zakończeniu testów wspólnych, usunięciu wad i przekazaniu kompletu dokumentów z Załącznika nr 3</w:t>
       </w:r>
-      <w:ins w:id="5068" w:author="Ewa Retajczyk" w:date="2026-10-20T15:11:46Z">
+      <w:ins w:id="5068" w:author="Ewa Retajczyk" w:date="2026-10-20T15:12:44Z">
         <w:r>
           <w:t xml:space="preserve"> (z wyłączeniem poz. 14)</w:t>
         </w:r>
@@ -2340,7 +2441,7 @@
       <w:r>
         <w:t xml:space="preserve"> Wykonawca przenosi na Zamawiającego, z chwilą ich powstania, autorskie prawa majątkowe do utworów powstałych w wykonaniu Umowy (w szczególności dokumentacji, schematów, konfiguracji i opracowań wykonanych na zamówienie) na wszystkich polach eksploatacji niezbędnych do korzystania z nich przez Zamawiającego, w tym utrwalania, zwielokrotniania, wprowadzania do pamięci komputera i sieci, modyfikowania i sporządzania opracowań, bez dodatkowego wynagrodzenia. Wykonawca zapewnia, że prawa te nie będą obciążone prawami osób trzecich, a osoby uprawnione z osobistych praw autorskich nie będą ich wykonywać wobec Zamawiającego i jego następców prawnych. W odniesieniu do oprogramowania standardowego Wykonawca udziela Zamawiającemu niewyłącznej licencji </w:t>
       </w:r>
-      <w:ins w:id="5148" w:author="Ewa Retajczyk" w:date="2026-10-20T15:11:54Z">
+      <w:ins w:id="5148" w:author="Ewa Retajczyk" w:date="2026-10-20T15:12:49Z">
         <w:r>
           <w:t xml:space="preserve">bezterminowej, a jeżeli model licencjonowania nie przewiduje licencji bezterminowej – </w:t>
         </w:r>
@@ -2348,7 +2449,7 @@
       <w:r>
         <w:t xml:space="preserve">na okres co najmniej okresu gwarancji, a w razie wymogów programu – trwałości inwestycji (5 lat), z prawem do aktualizacji; </w:t>
       </w:r>
-      <w:ins w:id="5149" w:author="Ewa Retajczyk" w:date="2026-10-20T15:11:58Z">
+      <w:ins w:id="5149" w:author="Ewa Retajczyk" w:date="2026-10-20T15:13:00Z">
         <w:r>
           <w:t xml:space="preserve">opłaty licencyjne za okres po dniu 31.12.2026 r. nie wchodzą w wynagrodzenie (§ 7 ust. 2) i zostaną uregulowane odrębnie; </w:t>
         </w:r>
@@ -2493,7 +2594,7 @@
         </w:rPr>
         <w:t xml:space="preserve">[</w:t>
       </w:r>
-      <w:del w:id="5069" w:author="Ewa Retajczyk" w:date="2026-10-20T15:12:27Z">
+      <w:del w:id="5069" w:author="Ewa Retajczyk" w:date="2026-10-20T15:13:28Z">
         <w:r>
           <w:rPr>
             <w:b/>
@@ -2509,7 +2610,7 @@
         </w:rPr>
         <w:t xml:space="preserve">60</w:t>
       </w:r>
-      <w:del w:id="5070" w:author="Ewa Retajczyk" w:date="2026-10-20T15:12:32Z">
+      <w:del w:id="5070" w:author="Ewa Retajczyk" w:date="2026-10-20T15:13:35Z">
         <w:r>
           <w:rPr>
             <w:b/>
@@ -2548,7 +2649,7 @@
       <w:r>
         <w:t xml:space="preserve">3. Wykonawca zapewnia serwis gwarancyjny </w:t>
       </w:r>
-      <w:del w:id="5071" w:author="Ewa Retajczyk" w:date="2026-10-20T15:12:34Z">
+      <w:del w:id="5071" w:author="Ewa Retajczyk" w:date="2026-10-20T15:13:41Z">
         <w:r>
           <w:delText xml:space="preserve">na zasadach z Oferty, </w:delText>
         </w:r>
@@ -2556,12 +2657,12 @@
       <w:r>
         <w:t xml:space="preserve">w </w:t>
       </w:r>
-      <w:del w:id="5072" w:author="Ewa Retajczyk" w:date="2026-10-20T15:12:44Z">
+      <w:del w:id="5072" w:author="Ewa Retajczyk" w:date="2026-10-20T15:13:51Z">
         <w:r>
           <w:delText xml:space="preserve">tym</w:delText>
         </w:r>
       </w:del>
-      <w:ins w:id="5073" w:author="Ewa Retajczyk" w:date="2026-10-20T15:12:49Z">
+      <w:ins w:id="5073" w:author="Ewa Retajczyk" w:date="2026-10-20T15:13:58Z">
         <w:r>
           <w:t xml:space="preserve">następujących parametrach</w:t>
         </w:r>
@@ -2569,7 +2670,7 @@
       <w:r>
         <w:t xml:space="preserve">: czas reakcji zdalnej </w:t>
       </w:r>
-      <w:ins w:id="5074" w:author="Ewa Retajczyk" w:date="2026-10-20T15:13:00Z">
+      <w:ins w:id="5074" w:author="Ewa Retajczyk" w:date="2026-10-20T15:14:13Z">
         <w:r>
           <w:t xml:space="preserve">– do </w:t>
         </w:r>
@@ -2580,7 +2681,7 @@
         </w:rPr>
         <w:t xml:space="preserve">[</w:t>
       </w:r>
-      <w:del w:id="5075" w:author="Ewa Retajczyk" w:date="2026-10-20T15:13:28Z">
+      <w:del w:id="5075" w:author="Ewa Retajczyk" w:date="2026-10-20T15:14:30Z">
         <w:r>
           <w:rPr>
             <w:highlight w:val="yellow"/>
@@ -2588,7 +2689,7 @@
           <w:delText xml:space="preserve">…</w:delText>
         </w:r>
       </w:del>
-      <w:ins w:id="5076" w:author="Ewa Retajczyk" w:date="2026-10-20T15:13:35Z">
+      <w:ins w:id="5076" w:author="Ewa Retajczyk" w:date="2026-10-20T15:14:32Z">
         <w:r>
           <w:rPr>
             <w:highlight w:val="yellow"/>
@@ -2605,12 +2706,12 @@
       <w:r>
         <w:t xml:space="preserve"> godz.</w:t>
       </w:r>
-      <w:del w:id="5077" w:author="Ewa Retajczyk" w:date="2026-10-20T15:13:41Z">
+      <w:del w:id="5077" w:author="Ewa Retajczyk" w:date="2026-10-20T15:14:40Z">
         <w:r>
           <w:delText xml:space="preserve">,</w:delText>
         </w:r>
       </w:del>
-      <w:ins w:id="5078" w:author="Ewa Retajczyk" w:date="2026-10-20T15:13:51Z">
+      <w:ins w:id="5078" w:author="Ewa Retajczyk" w:date="2026-10-20T15:15:13Z">
         <w:r>
           <w:t xml:space="preserve"> w dni robocze od zgłoszenia;</w:t>
         </w:r>
@@ -2618,7 +2719,7 @@
       <w:r>
         <w:t xml:space="preserve"> czas reakcji serwisowej na miejscu </w:t>
       </w:r>
-      <w:ins w:id="5079" w:author="Ewa Retajczyk" w:date="2026-10-20T15:14:13Z">
+      <w:ins w:id="5079" w:author="Ewa Retajczyk" w:date="2026-10-20T15:15:27Z">
         <w:r>
           <w:t xml:space="preserve">– do </w:t>
         </w:r>
@@ -2629,7 +2730,7 @@
         </w:rPr>
         <w:t xml:space="preserve">[</w:t>
       </w:r>
-      <w:del w:id="5080" w:author="Ewa Retajczyk" w:date="2026-10-20T15:14:32Z">
+      <w:del w:id="5080" w:author="Ewa Retajczyk" w:date="2026-10-20T15:15:45Z">
         <w:r>
           <w:rPr>
             <w:highlight w:val="yellow"/>
@@ -2637,7 +2738,7 @@
           <w:delText xml:space="preserve">…</w:delText>
         </w:r>
       </w:del>
-      <w:ins w:id="5081" w:author="Ewa Retajczyk" w:date="2026-10-20T15:14:40Z">
+      <w:ins w:id="5081" w:author="Ewa Retajczyk" w:date="2026-10-20T15:16:04Z">
         <w:r>
           <w:rPr>
             <w:highlight w:val="yellow"/>
@@ -2654,12 +2755,12 @@
       <w:r>
         <w:t xml:space="preserve"> godz.</w:t>
       </w:r>
-      <w:del w:id="5082" w:author="Ewa Retajczyk" w:date="2026-10-20T15:15:13Z">
+      <w:del w:id="5082" w:author="Ewa Retajczyk" w:date="2026-10-20T15:16:25Z">
         <w:r>
           <w:delText xml:space="preserve">,</w:delText>
         </w:r>
       </w:del>
-      <w:ins w:id="5083" w:author="Ewa Retajczyk" w:date="2026-10-20T15:15:27Z">
+      <w:ins w:id="5083" w:author="Ewa Retajczyk" w:date="2026-10-20T15:16:28Z">
         <w:r>
           <w:t xml:space="preserve"> od zgłoszenia;</w:t>
         </w:r>
@@ -2667,7 +2768,7 @@
       <w:r>
         <w:t xml:space="preserve"> maksymalny czas usunięcia awarii </w:t>
       </w:r>
-      <w:ins w:id="5084" w:author="Ewa Retajczyk" w:date="2026-10-20T15:15:45Z">
+      <w:ins w:id="5084" w:author="Ewa Retajczyk" w:date="2026-10-20T15:16:59Z">
         <w:r>
           <w:t xml:space="preserve">– do </w:t>
         </w:r>
@@ -2678,7 +2779,7 @@
         </w:rPr>
         <w:t xml:space="preserve">[</w:t>
       </w:r>
-      <w:del w:id="5085" w:author="Ewa Retajczyk" w:date="2026-10-20T15:16:04Z">
+      <w:del w:id="5085" w:author="Ewa Retajczyk" w:date="2026-10-20T15:17:11Z">
         <w:r>
           <w:rPr>
             <w:highlight w:val="yellow"/>
@@ -2686,7 +2787,7 @@
           <w:delText xml:space="preserve">…</w:delText>
         </w:r>
       </w:del>
-      <w:ins w:id="5086" w:author="Ewa Retajczyk" w:date="2026-10-20T15:16:25Z">
+      <w:ins w:id="5086" w:author="Ewa Retajczyk" w:date="2026-10-20T15:17:13Z">
         <w:r>
           <w:rPr>
             <w:highlight w:val="yellow"/>
@@ -2713,12 +2814,12 @@
       <w:r>
         <w:t xml:space="preserve"> godz.</w:t>
       </w:r>
-      <w:del w:id="5087" w:author="Ewa Retajczyk" w:date="2026-10-20T15:16:28Z">
+      <w:del w:id="5087" w:author="Ewa Retajczyk" w:date="2026-10-20T15:17:18Z">
         <w:r>
           <w:delText xml:space="preserve">/dni,</w:delText>
         </w:r>
       </w:del>
-      <w:ins w:id="5088" w:author="Ewa Retajczyk" w:date="2026-10-20T15:16:59Z">
+      <w:ins w:id="5088" w:author="Ewa Retajczyk" w:date="2026-10-20T15:17:23Z">
         <w:r>
           <w:t xml:space="preserve">;</w:t>
         </w:r>
@@ -2732,7 +2833,7 @@
         </w:rPr>
         <w:t xml:space="preserve">[</w:t>
       </w:r>
-      <w:del w:id="5089" w:author="Ewa Retajczyk" w:date="2026-10-20T15:17:11Z">
+      <w:del w:id="5089" w:author="Ewa Retajczyk" w:date="2026-10-20T15:17:26Z">
         <w:r>
           <w:rPr>
             <w:highlight w:val="yellow"/>
@@ -2740,7 +2841,7 @@
           <w:delText xml:space="preserve">…</w:delText>
         </w:r>
       </w:del>
-      <w:ins w:id="5090" w:author="Ewa Retajczyk" w:date="2026-10-20T15:17:13Z">
+      <w:ins w:id="5090" w:author="Ewa Retajczyk" w:date="2026-10-20T15:17:34Z">
         <w:r>
           <w:rPr>
             <w:highlight w:val="yellow"/>
@@ -2757,12 +2858,12 @@
       <w:r>
         <w:t xml:space="preserve"> lat</w:t>
       </w:r>
-      <w:del w:id="5091" w:author="Ewa Retajczyk" w:date="2026-10-20T15:17:18Z">
+      <w:del w:id="5091" w:author="Ewa Retajczyk" w:date="2026-10-20T15:17:40Z">
         <w:r>
           <w:delText xml:space="preserve">,</w:delText>
         </w:r>
       </w:del>
-      <w:ins w:id="5092" w:author="Ewa Retajczyk" w:date="2026-10-20T15:17:23Z">
+      <w:ins w:id="5092" w:author="Ewa Retajczyk" w:date="2026-10-20T15:17:49Z">
         <w:r>
           <w:t xml:space="preserve"> od dnia podpisania protokołu UDT dopuszczającego do eksploatacji ostatnią Stację ładowania;</w:t>
         </w:r>
@@ -2770,7 +2871,7 @@
       <w:r>
         <w:t xml:space="preserve"> przeglądy okresowe zgodnie z zaleceniami producenta, </w:t>
       </w:r>
-      <w:ins w:id="5093" w:author="Ewa Retajczyk" w:date="2026-10-20T15:17:26Z">
+      <w:ins w:id="5093" w:author="Ewa Retajczyk" w:date="2026-10-20T15:18:25Z">
         <w:r>
           <w:t xml:space="preserve">nie rzadziej niż </w:t>
         </w:r>
@@ -2787,12 +2888,12 @@
       <w:r>
         <w:t xml:space="preserve">aktualizacje oprogramowania </w:t>
       </w:r>
-      <w:del w:id="5094" w:author="Ewa Retajczyk" w:date="2026-10-20T15:17:34Z">
+      <w:del w:id="5094" w:author="Ewa Retajczyk" w:date="2026-10-20T15:18:31Z">
         <w:r>
           <w:delText xml:space="preserve">i</w:delText>
         </w:r>
       </w:del>
-      <w:ins w:id="5095" w:author="Ewa Retajczyk" w:date="2026-10-20T15:17:40Z">
+      <w:ins w:id="5095" w:author="Ewa Retajczyk" w:date="2026-10-20T15:18:49Z">
         <w:r>
           <w:t xml:space="preserve">w</w:t>
         </w:r>
@@ -2800,12 +2901,12 @@
       <w:r>
         <w:t xml:space="preserve"> </w:t>
       </w:r>
-      <w:del w:id="5096" w:author="Ewa Retajczyk" w:date="2026-10-20T15:17:49Z">
+      <w:del w:id="5096" w:author="Ewa Retajczyk" w:date="2026-10-20T15:19:01Z">
         <w:r>
           <w:delText xml:space="preserve">warunki</w:delText>
         </w:r>
       </w:del>
-      <w:ins w:id="5097" w:author="Ewa Retajczyk" w:date="2026-10-20T15:18:31Z">
+      <w:ins w:id="5097" w:author="Ewa Retajczyk" w:date="2026-10-20T15:19:10Z">
         <w:r>
           <w:t xml:space="preserve">okresie</w:t>
         </w:r>
@@ -2813,12 +2914,12 @@
       <w:r>
         <w:t xml:space="preserve"> </w:t>
       </w:r>
-      <w:del w:id="5098" w:author="Ewa Retajczyk" w:date="2026-10-20T15:18:49Z">
+      <w:del w:id="5098" w:author="Ewa Retajczyk" w:date="2026-10-20T15:19:24Z">
         <w:r>
           <w:delText xml:space="preserve">utrzymania</w:delText>
         </w:r>
       </w:del>
-      <w:ins w:id="5099" w:author="Ewa Retajczyk" w:date="2026-10-20T15:19:01Z">
+      <w:ins w:id="5099" w:author="Ewa Retajczyk" w:date="2026-10-20T15:19:31Z">
         <w:r>
           <w:t xml:space="preserve">gwarancji.</w:t>
         </w:r>
@@ -2826,12 +2927,12 @@
       <w:r>
         <w:t xml:space="preserve"> </w:t>
       </w:r>
-      <w:del w:id="5100" w:author="Ewa Retajczyk" w:date="2026-10-20T15:19:10Z">
+      <w:del w:id="5100" w:author="Ewa Retajczyk" w:date="2026-10-20T15:19:55Z">
         <w:r>
           <w:delText xml:space="preserve">systemu po</w:delText>
         </w:r>
       </w:del>
-      <w:ins w:id="5101" w:author="Ewa Retajczyk" w:date="2026-10-20T15:19:24Z">
+      <w:ins w:id="5101" w:author="Ewa Retajczyk" w:date="2026-10-20T15:20:02Z">
         <w:r>
           <w:t xml:space="preserve">Po</w:t>
         </w:r>
@@ -2839,7 +2940,7 @@
       <w:r>
         <w:t xml:space="preserve"> zakończeniu gwarancji</w:t>
       </w:r>
-      <w:del w:id="5102" w:author="Ewa Retajczyk" w:date="2026-10-20T15:19:31Z">
+      <w:del w:id="5102" w:author="Ewa Retajczyk" w:date="2026-10-20T15:20:03Z">
         <w:r>
           <w:delText xml:space="preserve">.</w:delText>
         </w:r>
@@ -2847,12 +2948,12 @@
       <w:r>
         <w:t xml:space="preserve"> </w:t>
       </w:r>
-      <w:del w:id="5103" w:author="Ewa Retajczyk" w:date="2026-10-20T15:19:55Z">
+      <w:del w:id="5103" w:author="Ewa Retajczyk" w:date="2026-10-20T15:20:17Z">
         <w:r>
           <w:delText xml:space="preserve">W</w:delText>
         </w:r>
       </w:del>
-      <w:ins w:id="5104" w:author="Ewa Retajczyk" w:date="2026-10-20T15:20:02Z">
+      <w:ins w:id="5104" w:author="Ewa Retajczyk" w:date="2026-10-20T15:20:24Z">
         <w:r>
           <w:t xml:space="preserve">Wykonawca</w:t>
         </w:r>
@@ -2860,12 +2961,12 @@
       <w:r>
         <w:t xml:space="preserve"> </w:t>
       </w:r>
-      <w:del w:id="5105" w:author="Ewa Retajczyk" w:date="2026-10-20T15:20:03Z">
+      <w:del w:id="5105" w:author="Ewa Retajczyk" w:date="2026-10-20T15:20:42Z">
         <w:r>
           <w:delText xml:space="preserve">razie</w:delText>
         </w:r>
       </w:del>
-      <w:ins w:id="5106" w:author="Ewa Retajczyk" w:date="2026-10-20T15:20:17Z">
+      <w:ins w:id="5106" w:author="Ewa Retajczyk" w:date="2026-10-20T15:20:51Z">
         <w:r>
           <w:t xml:space="preserve">przez</w:t>
         </w:r>
@@ -2873,12 +2974,12 @@
       <w:r>
         <w:t xml:space="preserve"> </w:t>
       </w:r>
-      <w:del w:id="5107" w:author="Ewa Retajczyk" w:date="2026-10-20T15:20:24Z">
+      <w:del w:id="5107" w:author="Ewa Retajczyk" w:date="2026-10-20T15:20:58Z">
         <w:r>
           <w:delText xml:space="preserve">niezgodności</w:delText>
         </w:r>
       </w:del>
-      <w:ins w:id="5108" w:author="Ewa Retajczyk" w:date="2026-10-20T15:20:42Z">
+      <w:ins w:id="5108" w:author="Ewa Retajczyk" w:date="2026-10-20T15:21:02Z">
         <w:r>
           <w:t xml:space="preserve">okres</w:t>
         </w:r>
@@ -2886,12 +2987,12 @@
       <w:r>
         <w:t xml:space="preserve"> </w:t>
       </w:r>
-      <w:del w:id="5109" w:author="Ewa Retajczyk" w:date="2026-10-20T15:20:51Z">
+      <w:del w:id="5109" w:author="Ewa Retajczyk" w:date="2026-10-20T15:21:53Z">
         <w:r>
           <w:delText xml:space="preserve">z</w:delText>
         </w:r>
       </w:del>
-      <w:ins w:id="5110" w:author="Ewa Retajczyk" w:date="2026-10-20T15:20:58Z">
+      <w:ins w:id="5110" w:author="Ewa Retajczyk" w:date="2026-10-20T15:22:42Z">
         <w:r>
           <w:t xml:space="preserve">co</w:t>
         </w:r>
@@ -2899,12 +3000,12 @@
       <w:r>
         <w:t xml:space="preserve"> </w:t>
       </w:r>
-      <w:del w:id="5111" w:author="Ewa Retajczyk" w:date="2026-10-20T15:21:02Z">
+      <w:del w:id="5111" w:author="Ewa Retajczyk" w:date="2026-10-20T15:22:56Z">
         <w:r>
           <w:delText xml:space="preserve">Ofertą</w:delText>
         </w:r>
       </w:del>
-      <w:ins w:id="5112" w:author="Ewa Retajczyk" w:date="2026-10-20T15:21:53Z">
+      <w:ins w:id="5112" w:author="Ewa Retajczyk" w:date="2026-10-20T15:23:02Z">
         <w:r>
           <w:t xml:space="preserve">najmniej</w:t>
         </w:r>
@@ -2912,12 +3013,12 @@
       <w:r>
         <w:t xml:space="preserve"> </w:t>
       </w:r>
-      <w:del w:id="5113" w:author="Ewa Retajczyk" w:date="2026-10-20T15:22:42Z">
+      <w:del w:id="5113" w:author="Ewa Retajczyk" w:date="2026-10-20T15:23:23Z">
         <w:r>
           <w:delText xml:space="preserve">stosuje</w:delText>
         </w:r>
       </w:del>
-      <w:ins w:id="5114" w:author="Ewa Retajczyk" w:date="2026-10-20T15:22:56Z">
+      <w:ins w:id="5114" w:author="Ewa Retajczyk" w:date="2026-10-20T15:23:49Z">
         <w:r>
           <w:rPr>
             <w:highlight w:val="yellow"/>
@@ -2928,12 +3029,12 @@
       <w:r>
         <w:t xml:space="preserve"> </w:t>
       </w:r>
-      <w:del w:id="5115" w:author="Ewa Retajczyk" w:date="2026-10-20T15:23:02Z">
+      <w:del w:id="5115" w:author="Ewa Retajczyk" w:date="2026-10-20T15:23:56Z">
         <w:r>
           <w:delText xml:space="preserve">się</w:delText>
         </w:r>
       </w:del>
-      <w:ins w:id="5116" w:author="Ewa Retajczyk" w:date="2026-10-20T15:23:23Z">
+      <w:ins w:id="5116" w:author="Ewa Retajczyk" w:date="2026-10-20T15:24:29Z">
         <w:r>
           <w:t xml:space="preserve">lat</w:t>
         </w:r>
@@ -2941,12 +3042,12 @@
       <w:r>
         <w:t xml:space="preserve"> </w:t>
       </w:r>
-      <w:del w:id="5117" w:author="Ewa Retajczyk" w:date="2026-10-20T15:23:49Z">
+      <w:del w:id="5117" w:author="Ewa Retajczyk" w:date="2026-10-20T15:24:34Z">
         <w:r>
           <w:delText xml:space="preserve">wartości</w:delText>
         </w:r>
       </w:del>
-      <w:ins w:id="5118" w:author="Ewa Retajczyk" w:date="2026-10-20T15:23:56Z">
+      <w:ins w:id="5118" w:author="Ewa Retajczyk" w:date="2026-10-20T15:24:39Z">
         <w:r>
           <w:t xml:space="preserve">zapewni</w:t>
         </w:r>
@@ -2954,12 +3055,12 @@
       <w:r>
         <w:t xml:space="preserve"> </w:t>
       </w:r>
-      <w:del w:id="5119" w:author="Ewa Retajczyk" w:date="2026-10-20T15:24:29Z">
+      <w:del w:id="5119" w:author="Ewa Retajczyk" w:date="2026-10-20T15:24:48Z">
         <w:r>
           <w:delText xml:space="preserve">korzystniejsze</w:delText>
         </w:r>
       </w:del>
-      <w:ins w:id="5120" w:author="Ewa Retajczyk" w:date="2026-10-20T15:24:34Z">
+      <w:ins w:id="5120" w:author="Ewa Retajczyk" w:date="2026-10-20T15:24:51Z">
         <w:r>
           <w:t xml:space="preserve">na</w:t>
         </w:r>
@@ -2967,12 +3068,12 @@
       <w:r>
         <w:t xml:space="preserve"> </w:t>
       </w:r>
-      <w:del w:id="5121" w:author="Ewa Retajczyk" w:date="2026-10-20T15:24:39Z">
+      <w:del w:id="5121" w:author="Ewa Retajczyk" w:date="2026-10-20T15:25:11Z">
         <w:r>
           <w:delText xml:space="preserve">dla</w:delText>
         </w:r>
       </w:del>
-      <w:ins w:id="5122" w:author="Ewa Retajczyk" w:date="2026-10-20T15:24:48Z">
+      <w:ins w:id="5122" w:author="Ewa Retajczyk" w:date="2026-10-20T15:25:28Z">
         <w:r>
           <w:t xml:space="preserve">żądanie</w:t>
         </w:r>
@@ -2980,7 +3081,7 @@
       <w:r>
         <w:t xml:space="preserve"> Zamawiającego</w:t>
       </w:r>
-      <w:ins w:id="5123" w:author="Ewa Retajczyk" w:date="2026-10-20T15:25:11Z">
+      <w:ins w:id="5123" w:author="Ewa Retajczyk" w:date="2026-10-20T15:25:45Z">
         <w:r>
           <w:t xml:space="preserve"> dostępność serwisu, części zamiennych i licencji na warunkach rynkowych</w:t>
         </w:r>
@@ -3016,7 +3117,7 @@
       <w:r>
         <w:t xml:space="preserve">). Wykonawca usuwa wady nieodpłatnie w terminach wskazanych w ust. 3; w przypadku awarii uniemożliwiającej działanie punktu ładowania usuwa ją w terminie </w:t>
       </w:r>
-      <w:del w:id="5124" w:author="Ewa Retajczyk" w:date="2026-10-20T15:25:45Z">
+      <w:del w:id="5124" w:author="Ewa Retajczyk" w:date="2026-10-20T15:25:55Z">
         <w:r>
           <w:rPr>
             <w:highlight w:val="yellow"/>
@@ -3024,7 +3125,7 @@
           <w:delText xml:space="preserve">[…</w:delText>
         </w:r>
       </w:del>
-      <w:ins w:id="5125" w:author="Ewa Retajczyk" w:date="2026-10-20T15:25:55Z">
+      <w:ins w:id="5125" w:author="Ewa Retajczyk" w:date="2026-10-20T15:26:08Z">
         <w:r>
           <w:t xml:space="preserve">określonym</w:t>
         </w:r>
@@ -3035,7 +3136,7 @@
         </w:rPr>
         <w:t xml:space="preserve"> </w:t>
       </w:r>
-      <w:del w:id="5126" w:author="Ewa Retajczyk" w:date="2026-10-20T15:26:08Z">
+      <w:del w:id="5126" w:author="Ewa Retajczyk" w:date="2026-10-20T15:26:13Z">
         <w:r>
           <w:rPr>
             <w:highlight w:val="yellow"/>
@@ -3043,7 +3144,7 @@
           <w:delText xml:space="preserve">godz</w:delText>
         </w:r>
       </w:del>
-      <w:ins w:id="5127" w:author="Ewa Retajczyk" w:date="2026-10-20T15:26:13Z">
+      <w:ins w:id="5127" w:author="Ewa Retajczyk" w:date="2026-10-20T15:26:14Z">
         <w:r>
           <w:rPr/>
           <w:t xml:space="preserve">w ust</w:t>
@@ -3055,7 +3156,7 @@
         </w:rPr>
         <w:t xml:space="preserve">.</w:t>
       </w:r>
-      <w:del w:id="5128" w:author="Ewa Retajczyk" w:date="2026-10-20T15:26:14Z">
+      <w:del w:id="5128" w:author="Ewa Retajczyk" w:date="2026-10-20T15:26:15Z">
         <w:r>
           <w:rPr>
             <w:highlight w:val="yellow"/>
@@ -3673,12 +3774,12 @@
       <w:r>
         <w:t xml:space="preserve">2. W zakresie danych osobowych osób wskazanych do realizacji Umowy Strony działają jako odrębni administratorzy w rozumieniu RODO i wzajemnie udostępniają sobie dane reprezentantów, pracowników i współpracowników w zakresie niezbędnym do wykonania Umowy. Każda ze Stron wykona obowiązek informacyjny wobec swoich osób; informacja Zamawiającego stanowi Załącznik nr </w:t>
       </w:r>
-      <w:del w:id="5130" w:author="Ewa Retajczyk" w:date="2026-10-20T15:26:15Z">
+      <w:del w:id="5130" w:author="Ewa Retajczyk" w:date="2026-10-20T15:26:30Z">
         <w:r>
           <w:delText xml:space="preserve">6</w:delText>
         </w:r>
       </w:del>
-      <w:ins w:id="5131" w:author="Ewa Retajczyk" w:date="2026-10-20T15:26:30Z">
+      <w:ins w:id="5131" w:author="Ewa Retajczyk" w:date="2026-10-20T15:26:31Z">
         <w:r>
           <w:t xml:space="preserve">4</w:t>
         </w:r>
@@ -3910,7 +4011,7 @@
       <w:r>
         <w:t xml:space="preserve">Oferta Wykonawcy (Formularz ofertowy</w:t>
       </w:r>
-      <w:ins w:id="5132" w:author="Ewa Retajczyk" w:date="2026-10-20T15:26:31Z">
+      <w:ins w:id="5132" w:author="Ewa Retajczyk" w:date="2026-10-20T15:26:59Z">
         <w:r>
           <w:t xml:space="preserve">, Specyfikacja, oświadczenia</w:t>
         </w:r>
@@ -3918,12 +4019,12 @@
       <w:r>
         <w:t xml:space="preserve"> i </w:t>
       </w:r>
-      <w:del w:id="5133" w:author="Ewa Retajczyk" w:date="2026-10-20T15:26:59Z">
+      <w:del w:id="5133" w:author="Ewa Retajczyk" w:date="2026-10-20T15:28:20Z">
         <w:r>
           <w:delText xml:space="preserve">Specyfikacja</w:delText>
         </w:r>
       </w:del>
-      <w:ins w:id="5134" w:author="Ewa Retajczyk" w:date="2026-10-20T15:28:20Z">
+      <w:ins w:id="5134" w:author="Ewa Retajczyk" w:date="2026-10-20T15:28:25Z">
         <w:r>
           <w:t xml:space="preserve">pozostałe dokumenty złożone w ofercie</w:t>
         </w:r>
@@ -4967,7 +5068,7 @@
               </w:rPr>
               <w:t xml:space="preserve">w terminie </w:t>
             </w:r>
-            <w:del w:id="5135" w:author="Ewa Retajczyk" w:date="2026-10-20T15:28:25Z">
+            <w:del w:id="5135" w:author="Ewa Retajczyk" w:date="2026-10-20T15:28:35Z">
               <w:r>
                 <w:rPr>
                   <w:sz w:val="20"/>
@@ -4976,7 +5077,7 @@
                 <w:delText xml:space="preserve">przekazania</w:delText>
               </w:r>
             </w:del>
-            <w:ins w:id="5136" w:author="Ewa Retajczyk" w:date="2026-10-20T15:28:35Z">
+            <w:ins w:id="5136" w:author="Ewa Retajczyk" w:date="2026-10-20T15:28:43Z">
               <w:r>
                 <w:rPr>
                   <w:sz w:val="20"/>
@@ -4992,7 +5093,7 @@
               </w:rPr>
               <w:t xml:space="preserve"> </w:t>
             </w:r>
-            <w:del w:id="5137" w:author="Ewa Retajczyk" w:date="2026-10-20T15:28:43Z">
+            <w:del w:id="5137" w:author="Ewa Retajczyk" w:date="2026-10-20T15:29:17Z">
               <w:r>
                 <w:rPr>
                   <w:sz w:val="20"/>
@@ -5001,7 +5102,7 @@
                 <w:delText xml:space="preserve">danych</w:delText>
               </w:r>
             </w:del>
-            <w:ins w:id="5138" w:author="Ewa Retajczyk" w:date="2026-10-20T15:29:17Z">
+            <w:ins w:id="5138" w:author="Ewa Retajczyk" w:date="2026-10-20T15:29:24Z">
               <w:r>
                 <w:rPr>
                   <w:sz w:val="20"/>
@@ -5017,7 +5118,7 @@
               </w:rPr>
               <w:t xml:space="preserve"> </w:t>
             </w:r>
-            <w:del w:id="5139" w:author="Ewa Retajczyk" w:date="2026-10-20T15:29:24Z">
+            <w:del w:id="5139" w:author="Ewa Retajczyk" w:date="2026-10-20T15:29:47Z">
               <w:r>
                 <w:rPr>
                   <w:sz w:val="20"/>

</xml_diff>